<commit_message>
Complete SOW generation, refinement, pricing, and diagram improvements
</commit_message>
<xml_diff>
--- a/backend/templates/sow_coverpage_template.docx
+++ b/backend/templates/sow_coverpage_template.docx
@@ -8,16 +8,16 @@
           <w:noProof/>
         </w:rPr>
         <w:drawing>
-          <wp:anchor distT="0" distB="0" distL="0" distR="0" simplePos="0" relativeHeight="251658240" behindDoc="1" locked="0" layoutInCell="1" hidden="0" allowOverlap="1" wp14:anchorId="795F3E43" wp14:editId="6D746E6D">
+          <wp:anchor distT="0" distB="0" distL="0" distR="0" simplePos="0" relativeHeight="251658240" behindDoc="1" locked="0" layoutInCell="1" hidden="0" allowOverlap="1" wp14:anchorId="795F3E43" wp14:editId="783E40B4">
             <wp:simplePos x="0" y="0"/>
             <wp:positionH relativeFrom="page">
-              <wp:posOffset>-146685</wp:posOffset>
+              <wp:posOffset>14079</wp:posOffset>
             </wp:positionH>
             <wp:positionV relativeFrom="page">
-              <wp:posOffset>101600</wp:posOffset>
+              <wp:posOffset>15240</wp:posOffset>
             </wp:positionV>
-            <wp:extent cx="7683500" cy="10544810"/>
-            <wp:effectExtent l="0" t="0" r="0" b="8890"/>
+            <wp:extent cx="7563485" cy="10641724"/>
+            <wp:effectExtent l="0" t="0" r="0" b="7620"/>
             <wp:wrapNone/>
             <wp:docPr id="4" name="image2.png"/>
             <wp:cNvGraphicFramePr/>
@@ -28,22 +28,27 @@
                     <pic:cNvPr id="0" name="image2.png"/>
                     <pic:cNvPicPr preferRelativeResize="0"/>
                   </pic:nvPicPr>
-                  <pic:blipFill>
+                  <pic:blipFill rotWithShape="1">
                     <a:blip r:embed="rId8"/>
-                    <a:srcRect l="-2138" t="-6672" r="2137" b="6672"/>
-                    <a:stretch>
-                      <a:fillRect/>
-                    </a:stretch>
+                    <a:srcRect l="-96" t="-6672" r="2136" b="6948"/>
+                    <a:stretch/>
                   </pic:blipFill>
-                  <pic:spPr>
+                  <pic:spPr bwMode="auto">
                     <a:xfrm>
                       <a:off x="0" y="0"/>
-                      <a:ext cx="7683500" cy="10544810"/>
+                      <a:ext cx="7563485" cy="10641724"/>
                     </a:xfrm>
                     <a:prstGeom prst="rect">
                       <a:avLst/>
                     </a:prstGeom>
-                    <a:ln/>
+                    <a:ln>
+                      <a:noFill/>
+                    </a:ln>
+                    <a:extLst>
+                      <a:ext uri="{53640926-AAD7-44D8-BBD7-CCE9431645EC}">
+                        <a14:shadowObscured xmlns:a14="http://schemas.microsoft.com/office/drawing/2010/main"/>
+                      </a:ext>
+                    </a:extLst>
                   </pic:spPr>
                 </pic:pic>
               </a:graphicData>
@@ -115,7 +120,7 @@
       <w:pPr>
         <w:ind w:hanging="425"/>
         <w:rPr>
-          <w:rFonts w:ascii="Plus Jakarta Sans" w:eastAsia="Plus Jakarta Sans" w:hAnsi="Plus Jakarta Sans" w:cs="Plus Jakarta Sans"/>
+          <w:rFonts w:ascii="DM Sans" w:eastAsia="Plus Jakarta Sans" w:hAnsi="DM Sans" w:cs="Plus Jakarta Sans"/>
           <w:color w:val="7F00FF"/>
           <w:sz w:val="64"/>
           <w:szCs w:val="64"/>
@@ -126,7 +131,7 @@
       <w:pPr>
         <w:ind w:hanging="425"/>
         <w:rPr>
-          <w:rFonts w:ascii="Plus Jakarta Sans" w:eastAsia="Plus Jakarta Sans" w:hAnsi="Plus Jakarta Sans" w:cs="Plus Jakarta Sans"/>
+          <w:rFonts w:ascii="DM Sans" w:eastAsia="Plus Jakarta Sans" w:hAnsi="DM Sans" w:cs="Plus Jakarta Sans"/>
           <w:color w:val="7F00FF"/>
           <w:sz w:val="64"/>
           <w:szCs w:val="64"/>
@@ -134,7 +139,7 @@
       </w:pPr>
       <w:r>
         <w:rPr>
-          <w:rFonts w:ascii="Plus Jakarta Sans" w:eastAsia="Plus Jakarta Sans" w:hAnsi="Plus Jakarta Sans" w:cs="Plus Jakarta Sans"/>
+          <w:rFonts w:ascii="DM Sans" w:eastAsia="Plus Jakarta Sans" w:hAnsi="DM Sans" w:cs="Plus Jakarta Sans"/>
           <w:color w:val="7F00FF"/>
           <w:sz w:val="64"/>
           <w:szCs w:val="64"/>
@@ -230,20 +235,7 @@
     </w:p>
     <w:p>
       <w:pPr>
-        <w:ind w:left="-425"/>
-        <w:rPr>
-          <w:b/>
-          <w:bCs/>
-          <w:color w:val="434343"/>
-          <w:sz w:val="48"/>
-          <w:szCs w:val="48"/>
-        </w:rPr>
-      </w:pPr>
-    </w:p>
-    <w:p>
-      <w:pPr>
         <w:spacing w:line="276" w:lineRule="auto"/>
-        <w:ind w:left="-425"/>
         <w:rPr>
           <w:rFonts w:ascii="DM Sans" w:eastAsia="DM Sans" w:hAnsi="DM Sans" w:cs="DM Sans"/>
           <w:b/>
@@ -257,7 +249,6 @@
     <w:p>
       <w:pPr>
         <w:spacing w:line="276" w:lineRule="auto"/>
-        <w:ind w:left="-425"/>
         <w:rPr>
           <w:rFonts w:ascii="DM Sans" w:eastAsia="DM Sans" w:hAnsi="DM Sans" w:cs="DM Sans"/>
           <w:b/>
@@ -265,6 +256,18 @@
           <w:color w:val="FFFFFF"/>
           <w:sz w:val="28"/>
           <w:szCs w:val="28"/>
+        </w:rPr>
+      </w:pPr>
+    </w:p>
+    <w:p>
+      <w:pPr>
+        <w:spacing w:line="276" w:lineRule="auto"/>
+        <w:ind w:left="-425"/>
+        <w:rPr>
+          <w:rFonts w:ascii="DM Sans" w:eastAsia="DM Sans" w:hAnsi="DM Sans" w:cs="DM Sans"/>
+          <w:color w:val="FFFFFF"/>
+          <w:sz w:val="24"/>
+          <w:szCs w:val="24"/>
         </w:rPr>
       </w:pPr>
       <w:proofErr w:type="spellStart"/>

</xml_diff>